<commit_message>
Fixed BUG-06, BUG-07, BUG-08 and updated Docs
</commit_message>
<xml_diff>
--- a/Docs/Amoba_Bugriport.docx
+++ b/Docs/Amoba_Bugriport.docx
@@ -1157,9 +1157,13 @@
               <w:ind/>
               <w:rPr/>
             </w:pPr>
+            <w:r/>
             <w:r>
-              <w:t xml:space="preserve">Javítás függőben</w:t>
+              <w:t xml:space="preserve">Javítva</w:t>
             </w:r>
+            <w:r/>
+            <w:r/>
+            <w:r/>
             <w:r/>
           </w:p>
         </w:tc>
@@ -1260,9 +1264,13 @@
               <w:ind/>
               <w:rPr/>
             </w:pPr>
+            <w:r/>
             <w:r>
-              <w:t xml:space="preserve">Javítás függőben</w:t>
+              <w:t xml:space="preserve">Javítva</w:t>
             </w:r>
+            <w:r/>
+            <w:r/>
+            <w:r/>
             <w:r/>
           </w:p>
         </w:tc>
@@ -1308,7 +1316,6 @@
               <w:t xml:space="preserve">8</w:t>
             </w:r>
             <w:r/>
-            <w:r/>
           </w:p>
         </w:tc>
         <w:tc>
@@ -1339,7 +1346,6 @@
               </w:rPr>
               <w:t xml:space="preserve">A winning_fields mező egy szinttel hibásan beágyazva érkezik</w:t>
             </w:r>
-            <w:r/>
             <w:r/>
           </w:p>
         </w:tc>
@@ -1372,7 +1378,6 @@
               <w:t xml:space="preserve">Közepes</w:t>
             </w:r>
             <w:r/>
-            <w:r/>
           </w:p>
         </w:tc>
         <w:tc>
@@ -1394,25 +1399,12 @@
               <w:ind/>
               <w:rPr/>
             </w:pPr>
+            <w:r/>
             <w:r>
-              <w:rPr>
-                <w:b w:val="0"/>
-                <w:bCs w:val="0"/>
-                <w:sz w:val="20"/>
-                <w:szCs w:val="20"/>
-              </w:rPr>
-              <w:t xml:space="preserve">Jav</w:t>
+              <w:t xml:space="preserve">Javítva</w:t>
             </w:r>
-            <w:r>
-              <w:rPr>
-                <w:b w:val="0"/>
-                <w:bCs w:val="0"/>
-                <w:sz w:val="20"/>
-                <w:szCs w:val="20"/>
-                <w:lang w:val="hu-HU"/>
-              </w:rPr>
-              <w:t xml:space="preserve">ítás függőben</w:t>
-            </w:r>
+            <w:r/>
+            <w:r/>
             <w:r/>
             <w:r/>
           </w:p>
@@ -5603,19 +5595,17 @@
               <w:pBdr/>
               <w:spacing/>
               <w:ind/>
-              <w:rPr>
-                <w:b/>
-                <w:bCs/>
-                <w:color w:val="ee0000"/>
-              </w:rPr>
+              <w:rPr/>
             </w:pPr>
             <w:r>
               <w:rPr>
                 <w:b/>
                 <w:bCs/>
-                <w:color w:val="ee0000"/>
+                <w:color w:val="2e7d32"/>
+                <w:sz w:val="20"/>
+                <w:szCs w:val="20"/>
               </w:rPr>
-              <w:t xml:space="preserve">Javítás függőben</w:t>
+              <w:t xml:space="preserve">Javítva</w:t>
             </w:r>
             <w:r>
               <w:rPr>
@@ -5624,13 +5614,7 @@
                 <w:color w:val="ee0000"/>
               </w:rPr>
             </w:r>
-            <w:r>
-              <w:rPr>
-                <w:b/>
-                <w:bCs/>
-                <w:color w:val="ee0000"/>
-              </w:rPr>
-            </w:r>
+            <w:r/>
           </w:p>
         </w:tc>
       </w:tr>
@@ -5686,7 +5670,28 @@
               <w:rPr/>
             </w:pPr>
             <w:r>
-              <w:t xml:space="preserve">-</w:t>
+              <w:rPr>
+                <w:lang w:val="hu-HU"/>
+              </w:rPr>
+              <w:t xml:space="preserve">A game.py-ban a </w:t>
+            </w:r>
+            <w:r>
+              <w:rPr>
+                <w:lang w:val="hu-HU"/>
+              </w:rPr>
+              <w:t xml:space="preserve">WIN_LENGTH = {3: 3} dictionary </w:t>
+            </w:r>
+            <w:r>
+              <w:rPr>
+                <w:lang w:val="hu-HU"/>
+              </w:rPr>
+              <w:t xml:space="preserve">WIN_LENGTH = {3: 3, 5: 4}</w:t>
+            </w:r>
+            <w:r>
+              <w:rPr>
+                <w:lang w:val="hu-HU"/>
+              </w:rPr>
+              <w:t xml:space="preserve">-re módosult, így frontend már képes felismerni, hogy létezik 5x5-ös játék is a backend-ben. Frontendben már az 5x5-ös mezők kidolgozásra kerültek a hiba észrevétele előtt.</w:t>
             </w:r>
             <w:r/>
           </w:p>
@@ -5744,7 +5749,10 @@
               <w:rPr/>
             </w:pPr>
             <w:r>
-              <w:t xml:space="preserve">-</w:t>
+              <w:rPr>
+                <w:lang w:val="hu-HU"/>
+              </w:rPr>
+              <w:t xml:space="preserve">2026-10-11</w:t>
             </w:r>
             <w:r/>
           </w:p>
@@ -6417,9 +6425,29 @@
               <w:rPr>
                 <w:b/>
                 <w:bCs/>
+                <w:color w:val="2e7d32"/>
+                <w:sz w:val="20"/>
+                <w:szCs w:val="20"/>
+                <w:lang w:val="hu-HU"/>
+              </w:rPr>
+              <w:t xml:space="preserve">J</w:t>
+            </w:r>
+            <w:r>
+              <w:rPr>
+                <w:b/>
+                <w:bCs/>
+                <w:color w:val="2e7d32"/>
+                <w:sz w:val="20"/>
+                <w:szCs w:val="20"/>
+              </w:rPr>
+              <w:t xml:space="preserve">avítva</w:t>
+            </w:r>
+            <w:r>
+              <w:rPr>
+                <w:b/>
+                <w:bCs/>
                 <w:color w:val="ee0000"/>
               </w:rPr>
-              <w:t xml:space="preserve">Javítás függőben</w:t>
             </w:r>
             <w:r/>
           </w:p>
@@ -6469,6 +6497,39 @@
             </w:tcMar>
             <w:tcW w:w="7200" w:type="dxa"/>
           </w:tcPr>
+          <w:p>
+            <w:pPr>
+              <w:pBdr/>
+              <w:spacing/>
+              <w:ind/>
+              <w:rPr/>
+            </w:pPr>
+            <w:r>
+              <w:rPr>
+                <w:lang w:val="hu-HU"/>
+              </w:rPr>
+              <w:t xml:space="preserve">A game.py-ban a </w:t>
+            </w:r>
+            <w:r>
+              <w:rPr>
+                <w:lang w:val="hu-HU"/>
+              </w:rPr>
+              <w:t xml:space="preserve">WIN_LENGTH = {3: 3} dictionary </w:t>
+            </w:r>
+            <w:r>
+              <w:rPr>
+                <w:lang w:val="hu-HU"/>
+              </w:rPr>
+              <w:t xml:space="preserve">WIN_LENGTH = {3: 3, 5: 4}</w:t>
+            </w:r>
+            <w:r>
+              <w:rPr>
+                <w:lang w:val="hu-HU"/>
+              </w:rPr>
+              <w:t xml:space="preserve">-re módosult, így frontend már képes felismerni, hogy létezik 5x5-ös játék is a backend-ben. Frontendben már az 5x5-ös mezők kidolgozásra kerültek a hiba észrevétele előtt.</w:t>
+            </w:r>
+            <w:r/>
+          </w:p>
           <w:p>
             <w:pPr>
               <w:pBdr/>
@@ -6532,7 +6593,12 @@
               <w:ind/>
               <w:rPr/>
             </w:pPr>
-            <w:r/>
+            <w:r>
+              <w:rPr>
+                <w:lang w:val="hu-HU"/>
+              </w:rPr>
+              <w:t xml:space="preserve">2026-10-11</w:t>
+            </w:r>
             <w:r/>
           </w:p>
         </w:tc>
@@ -6605,7 +6671,6 @@
       </w:pPr>
       <w:r/>
       <w:r/>
-      <w:r/>
     </w:p>
     <w:tbl>
       <w:tblPr>
@@ -6678,7 +6743,6 @@
               <w:t xml:space="preserve"> –  A winning_fields mező egy szinttel hibásan beágyazva érkezik</w:t>
             </w:r>
             <w:r/>
-            <w:r/>
           </w:p>
         </w:tc>
       </w:tr>
@@ -6715,7 +6779,6 @@
               <w:t xml:space="preserve">Leírás</w:t>
             </w:r>
             <w:r/>
-            <w:r/>
           </w:p>
         </w:tc>
         <w:tc>
@@ -6745,7 +6808,6 @@
               </w:rPr>
               <w:t xml:space="preserve">A Game.turn() metódusban győzelem esetén a self.winning_fields.append(winner) hívás a már listaként kapott nyerő mezősort (winner, pl. [[0,0],[0,1],[0,2]]) egy újabb listába ágyazta be, ahelyett hogy egyszerűen azt rendelte volna hozzá a mezőhöz.</w:t>
             </w:r>
-            <w:r/>
             <w:r/>
           </w:p>
         </w:tc>
@@ -6783,7 +6845,6 @@
               <w:t xml:space="preserve">Reprodukálás lépései</w:t>
             </w:r>
             <w:r/>
-            <w:r/>
           </w:p>
         </w:tc>
         <w:tc>
@@ -6815,7 +6876,6 @@
 2. Alakíts ki nyerő kombinációt (pl. X: (0,0), (0,1), (0,2)).
 3. Vizsgáld meg az utolsó válasz winning_fields mezőjét.</w:t>
             </w:r>
-            <w:r/>
             <w:r/>
           </w:p>
         </w:tc>
@@ -6852,7 +6912,6 @@
               </w:rPr>
               <w:t xml:space="preserve">Elvárt viselkedés</w:t>
             </w:r>
-            <w:r/>
             <w:r/>
           </w:p>
         </w:tc>
@@ -6894,7 +6953,6 @@
               <w:t xml:space="preserve"> És így kiemeltek lesznek a nyerő mezők.</w:t>
             </w:r>
             <w:r/>
-            <w:r/>
           </w:p>
         </w:tc>
       </w:tr>
@@ -6930,7 +6988,6 @@
               </w:rPr>
               <w:t xml:space="preserve">Tényleges viselkedés</w:t>
             </w:r>
-            <w:r/>
             <w:r/>
           </w:p>
         </w:tc>
@@ -7004,7 +7061,6 @@
               <w:t xml:space="preserve">Súlyosság</w:t>
             </w:r>
             <w:r/>
-            <w:r/>
           </w:p>
         </w:tc>
         <w:tc>
@@ -7034,7 +7090,6 @@
               </w:rPr>
               <w:t xml:space="preserve">Közepes – a játék a győzelmet helyesen felismerte és jelezte, de a nyerő mezők frontendes kiemelése emiatt nem működött volna a beágyazás miatt.</w:t>
             </w:r>
-            <w:r/>
             <w:r/>
           </w:p>
         </w:tc>
@@ -7072,7 +7127,6 @@
               <w:t xml:space="preserve">Érintett modul / fájl</w:t>
             </w:r>
             <w:r/>
-            <w:r/>
           </w:p>
         </w:tc>
         <w:tc>
@@ -7102,7 +7156,6 @@
               </w:rPr>
               <w:t xml:space="preserve">Backend, game.py, Game.turn() metódus.</w:t>
             </w:r>
-            <w:r/>
             <w:r/>
           </w:p>
         </w:tc>
@@ -7140,7 +7193,6 @@
               <w:t xml:space="preserve">Talált dátum / tesztelő</w:t>
             </w:r>
             <w:r/>
-            <w:r/>
           </w:p>
         </w:tc>
         <w:tc>
@@ -7170,7 +7222,6 @@
               </w:rPr>
               <w:t xml:space="preserve">2026-10-07, a frontend és a backend összekapcsolásakor.</w:t>
             </w:r>
-            <w:r/>
             <w:r/>
           </w:p>
         </w:tc>
@@ -7208,7 +7259,6 @@
               <w:t xml:space="preserve">Állapot</w:t>
             </w:r>
             <w:r/>
-            <w:r/>
           </w:p>
         </w:tc>
         <w:tc>
@@ -7239,7 +7289,6 @@
               </w:rPr>
               <w:t xml:space="preserve">Javítva</w:t>
             </w:r>
-            <w:r/>
             <w:r/>
           </w:p>
         </w:tc>
@@ -7277,7 +7326,6 @@
               <w:t xml:space="preserve">Javítás leírása</w:t>
             </w:r>
             <w:r/>
-            <w:r/>
           </w:p>
         </w:tc>
         <w:tc>
@@ -7307,7 +7355,6 @@
               </w:rPr>
               <w:t xml:space="preserve">A self.winning_fields.append(winner) sor self.winning_fields = winner-re módosult, mivel a winner már a teljes, kész mezőlistát tartalmazza.</w:t>
             </w:r>
-            <w:r/>
             <w:r/>
           </w:p>
         </w:tc>
@@ -7344,7 +7391,6 @@
               </w:rPr>
               <w:t xml:space="preserve">Javítás dátuma</w:t>
             </w:r>
-            <w:r/>
             <w:r/>
           </w:p>
         </w:tc>
@@ -7386,7 +7432,6 @@
               <w:t xml:space="preserve">11</w:t>
             </w:r>
             <w:r/>
-            <w:r/>
           </w:p>
         </w:tc>
       </w:tr>
@@ -7422,7 +7467,6 @@
               </w:rPr>
               <w:t xml:space="preserve">Kapcsolódó teszteset</w:t>
             </w:r>
-            <w:r/>
             <w:r/>
           </w:p>
         </w:tc>
@@ -7463,7 +7507,6 @@
               </w:rPr>
               <w:t xml:space="preserve">8</w:t>
             </w:r>
-            <w:r/>
             <w:r/>
           </w:p>
         </w:tc>

</xml_diff>